<commit_message>
Align press facts and FAQ with current plan boundaries
</commit_message>
<xml_diff>
--- a/dist/assets/press/2026-11-03-v7/01-documents/01-product-overview.docx
+++ b/dist/assets/press/2026-11-03-v7/01-documents/01-product-overview.docx
@@ -232,7 +232,7 @@
         </w:numPr>
       </w:pPr>
       <w:r>
-        <w:t xml:space="preserve">Leave feedback in context and collaborate with your team.</w:t>
+        <w:t xml:space="preserve">Leave feedback in context; collaborate with your team on Builder or Pro.</w:t>
       </w:r>
     </w:p>
     <w:p>
@@ -252,7 +252,7 @@
         <w:pStyle w:val="FirstParagraph"/>
       </w:pPr>
       <w:r>
-        <w:t xml:space="preserve">Atom provides identities, permissions and application data. A source download contains code; it does not export app users, business data or hosting infrastructure.</w:t>
+        <w:t xml:space="preserve">Atom provides identities, permissions and application data. Source downloads are available on Builder and Pro. They contain code, not app users, business data or hosting infrastructure.</w:t>
       </w:r>
     </w:p>
     <w:p>

</xml_diff>